<commit_message>
Update requirements and refresh presentations
- requirements/pyproject: drop unused Markdown dependency (reports build
  Markdown by hand); clarify that security.txt, disclosure email, and the LLM
  client use only the standard library
- product walkthrough deck: add Responsible Disclosure usage + code slides
  (24 slides), refresh test count 88 -> 111, renumber footers
- proposal deck (PPTX) + slide plan (DOCX): 88 -> 111 tests, mention the
  responsible-disclosure feature in solution and functional requirements
</commit_message>
<xml_diff>
--- a/SecurityOps-Assistant-Proposal-Presentation.docx
+++ b/SecurityOps-Assistant-Proposal-Presentation.docx
@@ -1517,6 +1517,19 @@
         <w:spacing w:after="60"/>
       </w:pPr>
       <w:r>
+        <w:t xml:space="preserve">Feature: responsible disclosure — curate findings, draft &amp; record vendor reports</w:t>
+      </w:r>
+    </w:p>
+    <w:p>
+      <w:pPr>
+        <w:pStyle w:val="ListParagraph"/>
+        <w:numPr>
+          <w:ilvl w:val="0"/>
+          <w:numId w:val="1"/>
+        </w:numPr>
+        <w:spacing w:after="60"/>
+      </w:pPr>
+      <w:r>
         <w:t xml:space="preserve">Feature: auto tool launcher, findings dashboard, and report generator</w:t>
       </w:r>
     </w:p>
@@ -1736,7 +1749,7 @@
           <w:sz w:val="21"/>
           <w:szCs w:val="21"/>
         </w:rPr>
-        <w:t xml:space="preserve">The architecture is layered, and dependencies point in one direction only. At the top is the PySide6 graphical interface. Below it are plugins — each feature is a self-contained plugin tab. Plugins use the mid-layer services: the workflow engine, the AI planner and local model, and the reporting system. At the bottom sit the core services — configuration, logging, the SQLite database, background threading, and the tool catalog — plus the data models. Now the component flow, step by step: the user's goal goes to the planner, which produces a plan; the plan passes through an approval gate where the human selects which steps to run; approved steps go to the execution engine, which launches the real tools as background processes; the tools' output is captured and passed to parsers that extract findings; and everything is written to the project database. The data flow, therefore, is: raw tool output becomes structured findings, which are stored in the project, and finally rendered into a report. Because the core never imports the interface, it can be tested headlessly — which is how the project reached 88 automated tests.</w:t>
+        <w:t xml:space="preserve">The architecture is layered, and dependencies point in one direction only. At the top is the PySide6 graphical interface. Below it are plugins — each feature is a self-contained plugin tab. Plugins use the mid-layer services: the workflow engine, the AI planner and local model, and the reporting system. At the bottom sit the core services — configuration, logging, the SQLite database, background threading, and the tool catalog — plus the data models. Now the component flow, step by step: the user's goal goes to the planner, which produces a plan; the plan passes through an approval gate where the human selects which steps to run; approved steps go to the execution engine, which launches the real tools as background processes; the tools' output is captured and passed to parsers that extract findings; and everything is written to the project database. The data flow, therefore, is: raw tool output becomes structured findings, which are stored in the project, and finally rendered into a report. Because the core never imports the interface, it can be tested headlessly — which is how the project reached 111 automated tests.</w:t>
       </w:r>
     </w:p>
     <w:p>
@@ -2466,7 +2479,7 @@
           <w:sz w:val="21"/>
           <w:szCs w:val="21"/>
         </w:rPr>
-        <w:t xml:space="preserve">I followed an Agile, iterative methodology, building the system one module at a time rather than attempting everything at once. Each short sprint took a single component — for example the database layer, then the workflow engine, then the bug bounty module — through the same cycle: plan, design, build, test, integrate, and review. This meant that at the end of every sprint I had a working, tested piece of the system rather than a large untested whole. The testing strategy has three parts: automated unit tests written with pytest that now number 88 and cover the non-visual logic; headless testing of the core, which is possible because the core does not depend on the interface; and manual verification of the graphical interface. New modules were continuously integrated into the shared platform — the same database, engine, and reporting system — so the application always remained runnable.</w:t>
+        <w:t xml:space="preserve">I followed an Agile, iterative methodology, building the system one module at a time rather than attempting everything at once. Each short sprint took a single component — for example the database layer, then the workflow engine, then the bug bounty module — through the same cycle: plan, design, build, test, integrate, and review. This meant that at the end of every sprint I had a working, tested piece of the system rather than a large untested whole. The testing strategy has three parts: automated unit tests written with pytest that now number 111 and cover the non-visual logic; headless testing of the core, which is possible because the core does not depend on the interface; and manual verification of the graphical interface. New modules were continuously integrated into the shared platform — the same database, engine, and reporting system — so the application always remained runnable.</w:t>
       </w:r>
     </w:p>
     <w:p>
@@ -2892,6 +2905,19 @@
     </w:p>
     <w:p>
       <w:pPr>
+        <w:pStyle w:val="ListParagraph"/>
+        <w:numPr>
+          <w:ilvl w:val="0"/>
+          <w:numId w:val="1"/>
+        </w:numPr>
+        <w:spacing w:after="60"/>
+      </w:pPr>
+      <w:r>
+        <w:t xml:space="preserve">Draft, review, and record responsible-disclosure reports (never auto-sent)</w:t>
+      </w:r>
+    </w:p>
+    <w:p>
+      <w:pPr>
         <w:spacing w:after="40" w:before="120"/>
       </w:pPr>
       <w:r>
@@ -3243,7 +3269,7 @@
         <w:spacing w:after="60"/>
       </w:pPr>
       <w:r>
-        <w:t xml:space="preserve">Modular, extensible, well-tested codebase (88 tests)</w:t>
+        <w:t xml:space="preserve">Modular, extensible, well-tested codebase (111 tests)</w:t>
       </w:r>
     </w:p>
     <w:p>
@@ -3388,7 +3414,7 @@
           <w:sz w:val="21"/>
           <w:szCs w:val="21"/>
         </w:rPr>
-        <w:t xml:space="preserve">The expected outcomes fall into three groups. Technically, the project delivers a working, fully offline assessment platform with a modular, extensible, and well-tested codebase — currently 88 automated tests — plus a reusable AI workflow and reporting engine that other tools could build on. For the user, the outcomes are practical: assessments are faster and guided, requiring less manual effort; privacy is strong and authorization is enforced; and the reports produced are consistent and professional. From a business and academic standpoint, the platform lowers the skill barrier for security testing, provides a reproducible and auditable methodology, and serves as a foundation for further research — for example into automated finding correlation. In short, the project produces both a usable tool and a base for future work.</w:t>
+        <w:t xml:space="preserve">The expected outcomes fall into three groups. Technically, the project delivers a working, fully offline assessment platform with a modular, extensible, and well-tested codebase — currently 111 automated tests — plus a reusable AI workflow and reporting engine that other tools could build on. For the user, the outcomes are practical: assessments are faster and guided, requiring less manual effort; privacy is strong and authorization is enforced; and the reports produced are consistent and professional. From a business and academic standpoint, the platform lowers the skill barrier for security testing, provides a reproducible and auditable methodology, and serves as a foundation for further research — for example into automated finding correlation. In short, the project produces both a usable tool and a base for future work.</w:t>
       </w:r>
     </w:p>
     <w:p>
@@ -3416,7 +3442,7 @@
           <w:sz w:val="21"/>
           <w:szCs w:val="21"/>
         </w:rPr>
-        <w:t xml:space="preserve">Three vertical outcome columns (Technical | User | Business/Academic), each headed with an icon and containing 2–3 concise points. Consider a large highlight stat (e.g., '88 automated tests') as a callout.</w:t>
+        <w:t xml:space="preserve">Three vertical outcome columns (Technical | User | Business/Academic), each headed with an icon and containing 2–3 concise points. Consider a large highlight stat (e.g., '111 automated tests') as a callout.</w:t>
       </w:r>
     </w:p>
     <w:p>

</xml_diff>